<commit_message>
deixa o texto do documento mais natural
</commit_message>
<xml_diff>
--- a/documento_projeto.docx
+++ b/documento_projeto.docx
@@ -41,22 +41,22 @@
         <w:pStyle w:val="Heading1"/>
       </w:pPr>
       <w:r>
-        <w:t>1. O que foi feito</w:t>
+        <w:t>1. O que fizemos</w:t>
       </w:r>
     </w:p>
     <w:p>
       <w:r>
-        <w:t>Foi construído um sistema completo que integra as etapas pedidas pelo enunciado: geração de dados IoT, envio para um servidor, armazenamento, análise de risco e apresentação de um resultado organizado. O fluxo segue exatamente a ordem pedida: IoT, Servidor, Dados, Análise, Resultado.</w:t>
+        <w:t>Montamos um sistema completo que integra as etapas pedidas no enunciado: geração de dados IoT, envio para um servidor, armazenamento, análise de risco e um resultado organizado no final. O fluxo segue a ordem pedida: IoT, Servidor, Dados, Análise, Resultado.</w:t>
       </w:r>
     </w:p>
     <w:p>
       <w:r>
-        <w:t>O enunciado pede para reaproveitar o código das Sprints 1 e 2 desta disciplina. Esse código não estava disponível no momento da construção deste projeto, então o sistema foi implementado do zero, cobrindo o mesmo fluxo que as Sprints 1 e 2 provavelmente já tinham feito separadamente (geração e envio de dados IoT na Sprint 1, análise e alertas na Sprint 2), agora integrado num único sistema funcional.</w:t>
+        <w:t>O enunciado pede pra reaproveitar o código das Sprints 1 e 2 da disciplina. A gente não tinha esse código em mãos na hora de montar esse projeto, então construímos do zero cobrindo o mesmo fluxo que as Sprints 1 e 2 provavelmente já cobriam separado (gerar e enviar dados IoT na Sprint 1, analisar e gerar alertas na Sprint 2), agora tudo integrado num sistema só.</w:t>
       </w:r>
     </w:p>
     <w:p>
       <w:r>
-        <w:t>O sistema simula sensores de temperatura e umidade em 5 equipamentos rurais. A cada execução, o gerador cria leituras normais e inclui de propósito algumas leituras problemáticas (temperatura alta, umidade baixa, dado incompleto e uma repetição), para garantir que todas as regras de risco possam ser demonstradas.</w:t>
+        <w:t>O sistema simula sensores de temperatura e umidade em 5 equipamentos rurais. A cada execução, o gerador cria leituras normais e mistura de propósito algumas leituras problemáticas (temperatura alta, umidade baixa, dado incompleto e uma repetição), pra garantir que dá pra ver todas as regras de risco funcionando.</w:t>
       </w:r>
     </w:p>
     <w:p>
@@ -408,7 +408,7 @@
     </w:p>
     <w:p>
       <w:r>
-        <w:t>Cada leitura recebida é avaliada contra um conjunto de regras. Toda regra que dispara soma pontos ao score do equipamento correspondente. O score final de um equipamento é a soma dos pontos de todas as suas leituras na rodada.</w:t>
+        <w:t>Cada leitura que chega passa por um conjunto de regras. Toda regra que dispara soma pontos ao score do equipamento correspondente. O score final de um equipamento é a soma dos pontos de todas as leituras dele na rodada.</w:t>
       </w:r>
     </w:p>
     <w:tbl>
@@ -656,7 +656,7 @@
     <w:p/>
     <w:p>
       <w:r>
-        <w:t>A classificação final segue a tabela definida pelo professor:</w:t>
+        <w:t>A classificação final segue a tabela que o professor deu no enunciado:</w:t>
       </w:r>
     </w:p>
     <w:tbl>
@@ -811,12 +811,12 @@
         <w:pStyle w:val="Heading2"/>
       </w:pPr>
       <w:r>
-        <w:t>4.1 Como o sistema evita dados inválidos</w:t>
+        <w:t>4.1 Como evitamos dados inválidos</w:t>
       </w:r>
     </w:p>
     <w:p>
       <w:r>
-        <w:t>A validação acontece no próprio servidor, antes de qualquer dado ser armazenado (função validar_payload em servidor/app.py). O servidor rejeita, com resposta HTTP 400, qualquer leitura que: não seja um objeto JSON válido; esteja sem os campos obrigatórios (equipamento, temperatura, timestamp); tenha temperatura ou umidade fora de uma faixa fisicamente plausível (temperatura entre -30°C e 80°C, umidade entre 0% e 100%). Isso garante que o que chega até a análise já passou por um primeiro filtro de sanidade.</w:t>
+        <w:t>A validação acontece no próprio servidor, antes de qualquer dado ser guardado (função validar_payload em servidor/app.py). O servidor rejeita, com resposta HTTP 400, qualquer leitura que: não seja um objeto JSON válido; esteja sem os campos obrigatórios (equipamento, temperatura, timestamp); ou tenha temperatura ou umidade fora de uma faixa fisicamente plausível (temperatura entre -30°C e 80°C, umidade entre 0% e 100%). Assim, o que chega na análise já passou por um primeiro filtro de sanidade.</w:t>
       </w:r>
     </w:p>
     <w:p>
@@ -824,12 +824,12 @@
         <w:pStyle w:val="Heading2"/>
       </w:pPr>
       <w:r>
-        <w:t>4.2 Como o sistema identifica dados suspeitos</w:t>
+        <w:t>4.2 Como identificamos dados suspeitos</w:t>
       </w:r>
     </w:p>
     <w:p>
       <w:r>
-        <w:t>Nem todo dado suspeito é claramente inválido, então a camada de análise (analise/seguranca.py) faz verificações adicionais depois que os dados já foram armazenados: confere de novo os limites físicos dos valores (defesa em profundidade, caso algo escape da validação do servidor); sinaliza leituras com timestamp no futuro; e sinaliza leituras com um atraso muito grande entre o horário registrado pelo sensor e o horário em que o servidor recebeu, o que pode indicar reenvio de um dado antigo (replay) ou relógio do sensor adulterado. A regra de repetição do próprio score de risco também funciona como um indício de dado suspeito: um sensor que envia exatamente a mesma leitura duas vezes seguidas pode estar com defeito ou sendo usado para inflar artificialmente os dados.</w:t>
+        <w:t>Nem todo dado suspeito é claramente inválido, então a camada de análise (analise/seguranca.py) faz umas checagens a mais depois que os dados já foram guardados: confere de novo os limites físicos dos valores (uma segunda camada de proteção, caso algo escape da validação do servidor); sinaliza leituras com timestamp no futuro; e sinaliza leituras com um atraso muito grande entre o horário que o sensor registrou e o horário que o servidor recebeu, o que pode indicar reenvio de um dado antigo (replay) ou relógio do sensor adulterado. A própria regra de repetição do score de risco também serve como indício de dado suspeito: um sensor que manda exatamente a mesma leitura duas vezes seguidas pode estar com defeito ou sendo usado pra inflar os dados de propósito.</w:t>
       </w:r>
     </w:p>
     <w:p>
@@ -842,7 +842,7 @@
     </w:p>
     <w:p>
       <w:r>
-        <w:t>Este é um MVP acadêmico e roda localmente sem essas proteções, mas para um sistema real de produção seriam necessárias, no mínimo:</w:t>
+        <w:t>Esse é um MVP acadêmico e roda local sem essas proteções, mas num sistema real de produção a gente precisaria de pelo menos:</w:t>
       </w:r>
     </w:p>
     <w:p>
@@ -850,7 +850,7 @@
         <w:pStyle w:val="ListBullet"/>
       </w:pPr>
       <w:r>
-        <w:t>Comunicação via HTTPS/TLS entre os dispositivos IoT e o servidor, para impedir que os dados sejam lidos ou alterados no meio do caminho.</w:t>
+        <w:t>Comunicação via HTTPS/TLS entre os dispositivos IoT e o servidor, pra impedir que os dados sejam lidos ou alterados no meio do caminho.</w:t>
       </w:r>
     </w:p>
     <w:p>
@@ -858,7 +858,7 @@
         <w:pStyle w:val="ListBullet"/>
       </w:pPr>
       <w:r>
-        <w:t>Autenticação por dispositivo (API key ou certificado por sensor), para o servidor só aceitar dados de equipamentos cadastrados e conseguir revogar acesso de um dispositivo comprometido.</w:t>
+        <w:t>Autenticação por dispositivo (API key ou certificado por sensor), pra o servidor só aceitar dados de equipamentos cadastrados e dar pra revogar o acesso de um dispositivo comprometido.</w:t>
       </w:r>
     </w:p>
     <w:p>
@@ -866,7 +866,7 @@
         <w:pStyle w:val="ListBullet"/>
       </w:pPr>
       <w:r>
-        <w:t>Limite de taxa de envio (rate limiting), para impedir que um sensor com defeito ou malicioso sobrecarregue o servidor ou inflate os dados.</w:t>
+        <w:t>Limite de taxa de envio (rate limiting), pra impedir que um sensor com defeito ou malicioso sobrecarregue o servidor ou infle os dados.</w:t>
       </w:r>
     </w:p>
     <w:p>
@@ -874,7 +874,7 @@
         <w:pStyle w:val="ListBullet"/>
       </w:pPr>
       <w:r>
-        <w:t>Assinatura ou hash de cada leitura, para detectar se o conteúdo foi alterado entre o sensor e o servidor.</w:t>
+        <w:t>Assinatura ou hash de cada leitura, pra detectar se o conteúdo foi alterado entre o sensor e o servidor.</w:t>
       </w:r>
     </w:p>
     <w:p>
@@ -882,7 +882,7 @@
         <w:pStyle w:val="ListBullet"/>
       </w:pPr>
       <w:r>
-        <w:t>Log de auditoria de tudo que é rejeitado, para acompanhar tentativas repetidas de envio de dados inválidos, o que pode indicar um sensor com defeito ou um ataque.</w:t>
+        <w:t>Log de auditoria de tudo que é rejeitado, pra acompanhar tentativas repetidas de envio de dados inválidos, o que pode indicar um sensor com defeito ou um ataque.</w:t>
       </w:r>
     </w:p>
     <w:p>

</xml_diff>